<commit_message>
Tài liệu sau đợt sửa giao diện: 06_giao_dien 5.1–5.2 (thực đơn trái, ô Mẫu, kiểm tra khi nhập, gợi ý, phân trang), 05_cai_dat TC33/TC34/TC43, PHAN_CONG_SUA (Q1, Q2 đã làm, thêm Q5, quy ước giao diện), KE_HOACH; dựng lại báo cáo tổng và file phân công
Co-Authored-By: Claude Opus 5.5 <noreply@anthropic.com>
</commit_message>
<xml_diff>
--- a/bao_cao/Phan_cong_sua_Nhom_10.docx
+++ b/bao_cao/Phan_cong_sua_Nhom_10.docx
@@ -647,7 +647,7 @@
                 <w:color w:val="000000"/>
                 <w:sz w:val="21"/>
               </w:rPr>
-              <w:t>Q1 trang lỗi tiếng Việt + bắt lỗi sao lưu · Q2 lưu nháp theo tài khoản · Q3 script kiểm tra phân quyền · Q4 sửa 06_bao_tri</w:t>
+              <w:t>Q3 script kiểm tra phân quyền · Q4 sửa 06_bao_tri · Q5 thử giao diện trên điện thoại thật và bản in (Q1, Q2 đã làm)</w:t>
             </w:r>
           </w:p>
         </w:tc>
@@ -681,7 +681,7 @@
                 <w:color w:val="000000"/>
                 <w:sz w:val="21"/>
               </w:rPr>
-              <w:t>(sửa TC33, TC34), TC42</w:t>
+              <w:t>TC42, (TC43)</w:t>
             </w:r>
           </w:p>
         </w:tc>
@@ -1543,6 +1543,405 @@
     </w:p>
     <w:p>
       <w:pPr>
+        <w:spacing w:after="60"/>
+        <w:ind w:left="454" w:hanging="255"/>
+        <w:jc w:val="left"/>
+      </w:pPr>
+      <w:r>
+        <w:rPr>
+          <w:rFonts w:ascii="Times New Roman" w:hAnsi="Times New Roman" w:eastAsia="Times New Roman" w:cs="Times New Roman"/>
+          <w:b w:val="0"/>
+          <w:i w:val="0"/>
+          <w:color w:val="000000"/>
+          <w:sz w:val="24"/>
+        </w:rPr>
+        <w:t>– Quy ước giao diện (06_giao_dien 5.2, đã làm sẵn, chỉ cần dùng đúng):</w:t>
+      </w:r>
+    </w:p>
+    <w:p>
+      <w:pPr>
+        <w:spacing w:after="60"/>
+        <w:ind w:left="794" w:hanging="255"/>
+        <w:jc w:val="left"/>
+      </w:pPr>
+      <w:r>
+        <w:rPr>
+          <w:rFonts w:ascii="Times New Roman" w:hAnsi="Times New Roman" w:eastAsia="Times New Roman" w:cs="Times New Roman"/>
+          <w:b w:val="0"/>
+          <w:i w:val="0"/>
+          <w:color w:val="000000"/>
+          <w:sz w:val="24"/>
+        </w:rPr>
+        <w:t xml:space="preserve">– hàng nút cuối form: </w:t>
+      </w:r>
+      <w:r>
+        <w:rPr>
+          <w:rFonts w:ascii="Consolas" w:hAnsi="Consolas" w:eastAsia="Consolas" w:cs="Consolas"/>
+          <w:b w:val="0"/>
+          <w:i w:val="0"/>
+          <w:color w:val="000000"/>
+          <w:sz w:val="22"/>
+        </w:rPr>
+        <w:t>&lt;partial name="_NutLenh" model="new NutLenh()" /&gt;</w:t>
+      </w:r>
+      <w:r>
+        <w:rPr>
+          <w:rFonts w:ascii="Times New Roman" w:hAnsi="Times New Roman" w:eastAsia="Times New Roman" w:cs="Times New Roman"/>
+          <w:b w:val="0"/>
+          <w:i w:val="0"/>
+          <w:color w:val="000000"/>
+          <w:sz w:val="24"/>
+        </w:rPr>
+        <w:t xml:space="preserve"> (Lưu · Hủy · Thoát; Ctrl+S, Esc tự có); form chỉ xem: </w:t>
+      </w:r>
+      <w:r>
+        <w:rPr>
+          <w:rFonts w:ascii="Consolas" w:hAnsi="Consolas" w:eastAsia="Consolas" w:cs="Consolas"/>
+          <w:b w:val="0"/>
+          <w:i w:val="0"/>
+          <w:color w:val="000000"/>
+          <w:sz w:val="22"/>
+        </w:rPr>
+        <w:t>new NutLenh(null)</w:t>
+      </w:r>
+      <w:r>
+        <w:rPr>
+          <w:rFonts w:ascii="Times New Roman" w:hAnsi="Times New Roman" w:eastAsia="Times New Roman" w:cs="Times New Roman"/>
+          <w:b w:val="0"/>
+          <w:i w:val="0"/>
+          <w:color w:val="000000"/>
+          <w:sz w:val="24"/>
+        </w:rPr>
+        <w:t>;</w:t>
+      </w:r>
+    </w:p>
+    <w:p>
+      <w:pPr>
+        <w:spacing w:after="60"/>
+        <w:ind w:left="794" w:hanging="255"/>
+        <w:jc w:val="left"/>
+      </w:pPr>
+      <w:r>
+        <w:rPr>
+          <w:rFonts w:ascii="Times New Roman" w:hAnsi="Times New Roman" w:eastAsia="Times New Roman" w:cs="Times New Roman"/>
+          <w:b w:val="0"/>
+          <w:i w:val="0"/>
+          <w:color w:val="000000"/>
+          <w:sz w:val="24"/>
+        </w:rPr>
+        <w:t xml:space="preserve">– mỗi ô nhập có nhãn </w:t>
+      </w:r>
+      <w:r>
+        <w:rPr>
+          <w:rFonts w:ascii="Consolas" w:hAnsi="Consolas" w:eastAsia="Consolas" w:cs="Consolas"/>
+          <w:b w:val="0"/>
+          <w:i w:val="0"/>
+          <w:color w:val="000000"/>
+          <w:sz w:val="22"/>
+        </w:rPr>
+        <w:t>&lt;label for="…"&gt;</w:t>
+      </w:r>
+      <w:r>
+        <w:rPr>
+          <w:rFonts w:ascii="Times New Roman" w:hAnsi="Times New Roman" w:eastAsia="Times New Roman" w:cs="Times New Roman"/>
+          <w:b w:val="0"/>
+          <w:i w:val="0"/>
+          <w:color w:val="000000"/>
+          <w:sz w:val="24"/>
+        </w:rPr>
+        <w:t xml:space="preserve">; ô trong bảng không có nhãn thì thêm </w:t>
+      </w:r>
+      <w:r>
+        <w:rPr>
+          <w:rFonts w:ascii="Consolas" w:hAnsi="Consolas" w:eastAsia="Consolas" w:cs="Consolas"/>
+          <w:b w:val="0"/>
+          <w:i w:val="0"/>
+          <w:color w:val="000000"/>
+          <w:sz w:val="22"/>
+        </w:rPr>
+        <w:t>aria-label</w:t>
+      </w:r>
+      <w:r>
+        <w:rPr>
+          <w:rFonts w:ascii="Times New Roman" w:hAnsi="Times New Roman" w:eastAsia="Times New Roman" w:cs="Times New Roman"/>
+          <w:b w:val="0"/>
+          <w:i w:val="0"/>
+          <w:color w:val="000000"/>
+          <w:sz w:val="24"/>
+        </w:rPr>
+        <w:t xml:space="preserve">; trường có quy tắc định dạng thêm </w:t>
+      </w:r>
+      <w:r>
+        <w:rPr>
+          <w:rFonts w:ascii="Consolas" w:hAnsi="Consolas" w:eastAsia="Consolas" w:cs="Consolas"/>
+          <w:b w:val="0"/>
+          <w:i w:val="0"/>
+          <w:color w:val="000000"/>
+          <w:sz w:val="22"/>
+        </w:rPr>
+        <w:t>title="…"</w:t>
+      </w:r>
+      <w:r>
+        <w:rPr>
+          <w:rFonts w:ascii="Times New Roman" w:hAnsi="Times New Roman" w:eastAsia="Times New Roman" w:cs="Times New Roman"/>
+          <w:b w:val="0"/>
+          <w:i w:val="0"/>
+          <w:color w:val="000000"/>
+          <w:sz w:val="24"/>
+        </w:rPr>
+        <w:t xml:space="preserve"> (chú thích khi trỏ chuột, cũng là câu báo khi nhập sai </w:t>
+      </w:r>
+      <w:r>
+        <w:rPr>
+          <w:rFonts w:ascii="Consolas" w:hAnsi="Consolas" w:eastAsia="Consolas" w:cs="Consolas"/>
+          <w:b w:val="0"/>
+          <w:i w:val="0"/>
+          <w:color w:val="000000"/>
+          <w:sz w:val="22"/>
+        </w:rPr>
+        <w:t>pattern</w:t>
+      </w:r>
+      <w:r>
+        <w:rPr>
+          <w:rFonts w:ascii="Times New Roman" w:hAnsi="Times New Roman" w:eastAsia="Times New Roman" w:cs="Times New Roman"/>
+          <w:b w:val="0"/>
+          <w:i w:val="0"/>
+          <w:color w:val="000000"/>
+          <w:sz w:val="24"/>
+        </w:rPr>
+        <w:t>);</w:t>
+      </w:r>
+    </w:p>
+    <w:p>
+      <w:pPr>
+        <w:spacing w:after="60"/>
+        <w:ind w:left="794" w:hanging="255"/>
+        <w:jc w:val="left"/>
+      </w:pPr>
+      <w:r>
+        <w:rPr>
+          <w:rFonts w:ascii="Times New Roman" w:hAnsi="Times New Roman" w:eastAsia="Times New Roman" w:cs="Times New Roman"/>
+          <w:b w:val="0"/>
+          <w:i w:val="0"/>
+          <w:color w:val="000000"/>
+          <w:sz w:val="24"/>
+        </w:rPr>
+        <w:t xml:space="preserve">– trường bắt buộc: chỉ cần nhãn có lớp </w:t>
+      </w:r>
+      <w:r>
+        <w:rPr>
+          <w:rFonts w:ascii="Consolas" w:hAnsi="Consolas" w:eastAsia="Consolas" w:cs="Consolas"/>
+          <w:b w:val="0"/>
+          <w:i w:val="0"/>
+          <w:color w:val="000000"/>
+          <w:sz w:val="22"/>
+        </w:rPr>
+        <w:t>bat-buoc</w:t>
+      </w:r>
+      <w:r>
+        <w:rPr>
+          <w:rFonts w:ascii="Times New Roman" w:hAnsi="Times New Roman" w:eastAsia="Times New Roman" w:cs="Times New Roman"/>
+          <w:b w:val="0"/>
+          <w:i w:val="0"/>
+          <w:color w:val="000000"/>
+          <w:sz w:val="24"/>
+        </w:rPr>
+        <w:t xml:space="preserve"> (hiện dấu </w:t>
+      </w:r>
+      <w:r>
+        <w:rPr>
+          <w:rFonts w:ascii="Consolas" w:hAnsi="Consolas" w:eastAsia="Consolas" w:cs="Consolas"/>
+          <w:b w:val="0"/>
+          <w:i w:val="0"/>
+          <w:color w:val="000000"/>
+          <w:sz w:val="22"/>
+        </w:rPr>
+        <w:t>*</w:t>
+      </w:r>
+      <w:r>
+        <w:rPr>
+          <w:rFonts w:ascii="Times New Roman" w:hAnsi="Times New Roman" w:eastAsia="Times New Roman" w:cs="Times New Roman"/>
+          <w:b w:val="0"/>
+          <w:i w:val="0"/>
+          <w:color w:val="000000"/>
+          <w:sz w:val="24"/>
+        </w:rPr>
+        <w:t>), trình duyệt tự chặn để trống;</w:t>
+      </w:r>
+    </w:p>
+    <w:p>
+      <w:pPr>
+        <w:spacing w:after="60"/>
+        <w:ind w:left="794" w:hanging="255"/>
+        <w:jc w:val="left"/>
+      </w:pPr>
+      <w:r>
+        <w:rPr>
+          <w:rFonts w:ascii="Times New Roman" w:hAnsi="Times New Roman" w:eastAsia="Times New Roman" w:cs="Times New Roman"/>
+          <w:b w:val="0"/>
+          <w:i w:val="0"/>
+          <w:color w:val="000000"/>
+          <w:sz w:val="24"/>
+        </w:rPr>
+        <w:t xml:space="preserve">– ô nhập mã học viên: </w:t>
+      </w:r>
+      <w:r>
+        <w:rPr>
+          <w:rFonts w:ascii="Consolas" w:hAnsi="Consolas" w:eastAsia="Consolas" w:cs="Consolas"/>
+          <w:b w:val="0"/>
+          <w:i w:val="0"/>
+          <w:color w:val="000000"/>
+          <w:sz w:val="22"/>
+        </w:rPr>
+        <w:t>list="ds-hoc-vien"</w:t>
+      </w:r>
+      <w:r>
+        <w:rPr>
+          <w:rFonts w:ascii="Times New Roman" w:hAnsi="Times New Roman" w:eastAsia="Times New Roman" w:cs="Times New Roman"/>
+          <w:b w:val="0"/>
+          <w:i w:val="0"/>
+          <w:color w:val="000000"/>
+          <w:sz w:val="24"/>
+        </w:rPr>
+        <w:t xml:space="preserve"> và thêm </w:t>
+      </w:r>
+      <w:r>
+        <w:rPr>
+          <w:rFonts w:ascii="Consolas" w:hAnsi="Consolas" w:eastAsia="Consolas" w:cs="Consolas"/>
+          <w:b w:val="0"/>
+          <w:i w:val="0"/>
+          <w:color w:val="000000"/>
+          <w:sz w:val="22"/>
+        </w:rPr>
+        <w:t>&lt;partial name="_GoiYHocVien" /&gt;</w:t>
+      </w:r>
+      <w:r>
+        <w:rPr>
+          <w:rFonts w:ascii="Times New Roman" w:hAnsi="Times New Roman" w:eastAsia="Times New Roman" w:cs="Times New Roman"/>
+          <w:b w:val="0"/>
+          <w:i w:val="0"/>
+          <w:color w:val="000000"/>
+          <w:sz w:val="24"/>
+        </w:rPr>
+        <w:t xml:space="preserve"> cuối trang;</w:t>
+      </w:r>
+    </w:p>
+    <w:p>
+      <w:pPr>
+        <w:spacing w:after="60"/>
+        <w:ind w:left="794" w:hanging="255"/>
+        <w:jc w:val="left"/>
+      </w:pPr>
+      <w:r>
+        <w:rPr>
+          <w:rFonts w:ascii="Times New Roman" w:hAnsi="Times New Roman" w:eastAsia="Times New Roman" w:cs="Times New Roman"/>
+          <w:b w:val="0"/>
+          <w:i w:val="0"/>
+          <w:color w:val="000000"/>
+          <w:sz w:val="24"/>
+        </w:rPr>
+        <w:t xml:space="preserve">– danh sách có thể dài: </w:t>
+      </w:r>
+      <w:r>
+        <w:rPr>
+          <w:rFonts w:ascii="Consolas" w:hAnsi="Consolas" w:eastAsia="Consolas" w:cs="Consolas"/>
+          <w:b w:val="0"/>
+          <w:i w:val="0"/>
+          <w:color w:val="000000"/>
+          <w:sz w:val="22"/>
+        </w:rPr>
+        <w:t>.LayTrangAsync(trang, so)</w:t>
+      </w:r>
+      <w:r>
+        <w:rPr>
+          <w:rFonts w:ascii="Times New Roman" w:hAnsi="Times New Roman" w:eastAsia="Times New Roman" w:cs="Times New Roman"/>
+          <w:b w:val="0"/>
+          <w:i w:val="0"/>
+          <w:color w:val="000000"/>
+          <w:sz w:val="24"/>
+        </w:rPr>
+        <w:t xml:space="preserve"> (</w:t>
+      </w:r>
+      <w:r>
+        <w:rPr>
+          <w:rFonts w:ascii="Consolas" w:hAnsi="Consolas" w:eastAsia="Consolas" w:cs="Consolas"/>
+          <w:b w:val="0"/>
+          <w:i w:val="0"/>
+          <w:color w:val="000000"/>
+          <w:sz w:val="22"/>
+        </w:rPr>
+        <w:t>Nen/PhanTrang.cs</w:t>
+      </w:r>
+      <w:r>
+        <w:rPr>
+          <w:rFonts w:ascii="Times New Roman" w:hAnsi="Times New Roman" w:eastAsia="Times New Roman" w:cs="Times New Roman"/>
+          <w:b w:val="0"/>
+          <w:i w:val="0"/>
+          <w:color w:val="000000"/>
+          <w:sz w:val="24"/>
+        </w:rPr>
+        <w:t xml:space="preserve">) và </w:t>
+      </w:r>
+      <w:r>
+        <w:rPr>
+          <w:rFonts w:ascii="Consolas" w:hAnsi="Consolas" w:eastAsia="Consolas" w:cs="Consolas"/>
+          <w:b w:val="0"/>
+          <w:i w:val="0"/>
+          <w:color w:val="000000"/>
+          <w:sz w:val="22"/>
+        </w:rPr>
+        <w:t>&lt;partial name="_PhanTrang" model="Model.Trang" /&gt;</w:t>
+      </w:r>
+      <w:r>
+        <w:rPr>
+          <w:rFonts w:ascii="Times New Roman" w:hAnsi="Times New Roman" w:eastAsia="Times New Roman" w:cs="Times New Roman"/>
+          <w:b w:val="0"/>
+          <w:i w:val="0"/>
+          <w:color w:val="000000"/>
+          <w:sz w:val="24"/>
+        </w:rPr>
+        <w:t>;</w:t>
+      </w:r>
+    </w:p>
+    <w:p>
+      <w:pPr>
+        <w:spacing w:after="60"/>
+        <w:ind w:left="794" w:hanging="255"/>
+        <w:jc w:val="left"/>
+      </w:pPr>
+      <w:r>
+        <w:rPr>
+          <w:rFonts w:ascii="Times New Roman" w:hAnsi="Times New Roman" w:eastAsia="Times New Roman" w:cs="Times New Roman"/>
+          <w:b w:val="0"/>
+          <w:i w:val="0"/>
+          <w:color w:val="000000"/>
+          <w:sz w:val="24"/>
+        </w:rPr>
+        <w:t xml:space="preserve">– chỉ dùng màu có sẵn (đen, xám, đỏ </w:t>
+      </w:r>
+      <w:r>
+        <w:rPr>
+          <w:rFonts w:ascii="Consolas" w:hAnsi="Consolas" w:eastAsia="Consolas" w:cs="Consolas"/>
+          <w:b w:val="0"/>
+          <w:i w:val="0"/>
+          <w:color w:val="000000"/>
+          <w:sz w:val="22"/>
+        </w:rPr>
+        <w:t>canh-bao</w:t>
+      </w:r>
+      <w:r>
+        <w:rPr>
+          <w:rFonts w:ascii="Times New Roman" w:hAnsi="Times New Roman" w:eastAsia="Times New Roman" w:cs="Times New Roman"/>
+          <w:b w:val="0"/>
+          <w:i w:val="0"/>
+          <w:color w:val="000000"/>
+          <w:sz w:val="24"/>
+        </w:rPr>
+        <w:t xml:space="preserve"> cho cảnh báo); không thêm màu riêng.</w:t>
+      </w:r>
+    </w:p>
+    <w:p>
+      <w:pPr>
         <w:spacing w:after="120"/>
         <w:jc w:val="both"/>
       </w:pPr>
@@ -5369,10 +5768,46 @@
     </w:p>
     <w:p>
       <w:pPr>
+        <w:spacing w:after="120"/>
+        <w:jc w:val="both"/>
+      </w:pPr>
+      <w:r>
+        <w:rPr>
+          <w:rFonts w:ascii="Times New Roman" w:hAnsi="Times New Roman" w:eastAsia="Times New Roman" w:cs="Times New Roman"/>
+          <w:b w:val="0"/>
+          <w:i w:val="0"/>
+          <w:color w:val="000000"/>
+          <w:sz w:val="24"/>
+        </w:rPr>
+        <w:t xml:space="preserve">Q1 (trang lỗi tiếng Việt, bắt lỗi sao lưu) và Q2 (lưu nháp theo tài khoản) </w:t>
+      </w:r>
+      <w:r>
+        <w:rPr>
+          <w:rFonts w:ascii="Times New Roman" w:hAnsi="Times New Roman" w:eastAsia="Times New Roman" w:cs="Times New Roman"/>
+          <w:b/>
+          <w:i w:val="0"/>
+          <w:color w:val="000000"/>
+          <w:sz w:val="24"/>
+        </w:rPr>
+        <w:t>đã làm</w:t>
+      </w:r>
+      <w:r>
+        <w:rPr>
+          <w:rFonts w:ascii="Times New Roman" w:hAnsi="Times New Roman" w:eastAsia="Times New Roman" w:cs="Times New Roman"/>
+          <w:b w:val="0"/>
+          <w:i w:val="0"/>
+          <w:color w:val="000000"/>
+          <w:sz w:val="24"/>
+        </w:rPr>
+        <w:t xml:space="preserve"> trong đợt sửa giao diện ngày 11/10 (ca TC33, TC34 đã cập nhật).</w:t>
+      </w:r>
+    </w:p>
+    <w:p>
+      <w:pPr>
         <w:pStyle w:val="Heading3"/>
       </w:pPr>
       <w:r>
-        <w:t>Q1. Trang lỗi tiếng Việt, bắt lỗi khi sao lưu (N7, N4)</w:t>
+        <w:t>Q3. Script kiểm tra phân quyền 8 vai trò (làm sau cùng, khi các trang mới đã gộp)</w:t>
       </w:r>
     </w:p>
     <w:p>
@@ -5399,17 +5834,17 @@
           <w:color w:val="000000"/>
           <w:sz w:val="24"/>
         </w:rPr>
-        <w:t>Lỗi:</w:t>
-      </w:r>
-      <w:r>
-        <w:rPr>
-          <w:rFonts w:ascii="Times New Roman" w:hAnsi="Times New Roman" w:eastAsia="Times New Roman" w:cs="Times New Roman"/>
-          <w:b w:val="0"/>
-          <w:i w:val="0"/>
-          <w:color w:val="000000"/>
-          <w:sz w:val="24"/>
-        </w:rPr>
-        <w:t xml:space="preserve"> </w:t>
+        <w:t>Vì sao:</w:t>
+      </w:r>
+      <w:r>
+        <w:rPr>
+          <w:rFonts w:ascii="Times New Roman" w:hAnsi="Times New Roman" w:eastAsia="Times New Roman" w:cs="Times New Roman"/>
+          <w:b w:val="0"/>
+          <w:i w:val="0"/>
+          <w:color w:val="000000"/>
+          <w:sz w:val="24"/>
+        </w:rPr>
+        <w:t xml:space="preserve"> "Phân quyền: đạt" ở </w:t>
       </w:r>
       <w:r>
         <w:rPr>
@@ -5419,57 +5854,17 @@
           <w:color w:val="000000"/>
           <w:sz w:val="22"/>
         </w:rPr>
-        <w:t>Pages/Error.cshtml</w:t>
-      </w:r>
-      <w:r>
-        <w:rPr>
-          <w:rFonts w:ascii="Times New Roman" w:hAnsi="Times New Roman" w:eastAsia="Times New Roman" w:cs="Times New Roman"/>
-          <w:b w:val="0"/>
-          <w:i w:val="0"/>
-          <w:color w:val="000000"/>
-          <w:sz w:val="24"/>
-        </w:rPr>
-        <w:t xml:space="preserve"> còn nguyên mẫu tiếng Anh ("An error occurred while processing your request"), trái quy tắc thông báo lỗi tiếng Việt (</w:t>
-      </w:r>
-      <w:r>
-        <w:rPr>
-          <w:rFonts w:ascii="Consolas" w:hAnsi="Consolas" w:eastAsia="Consolas" w:cs="Consolas"/>
-          <w:b w:val="0"/>
-          <w:i w:val="0"/>
-          <w:color w:val="000000"/>
-          <w:sz w:val="22"/>
-        </w:rPr>
-        <w:t>06_giao_dien.md</w:t>
-      </w:r>
-      <w:r>
-        <w:rPr>
-          <w:rFonts w:ascii="Times New Roman" w:hAnsi="Times New Roman" w:eastAsia="Times New Roman" w:cs="Times New Roman"/>
-          <w:b w:val="0"/>
-          <w:i w:val="0"/>
-          <w:color w:val="000000"/>
-          <w:sz w:val="24"/>
-        </w:rPr>
-        <w:t xml:space="preserve"> mục 6). Trang sao lưu </w:t>
-      </w:r>
-      <w:r>
-        <w:rPr>
-          <w:rFonts w:ascii="Consolas" w:hAnsi="Consolas" w:eastAsia="Consolas" w:cs="Consolas"/>
-          <w:b w:val="0"/>
-          <w:i w:val="0"/>
-          <w:color w:val="000000"/>
-          <w:sz w:val="22"/>
-        </w:rPr>
-        <w:t>Pages/HeThong/SaoLuu.cshtml.cs</w:t>
-      </w:r>
-      <w:r>
-        <w:rPr>
-          <w:rFonts w:ascii="Times New Roman" w:hAnsi="Times New Roman" w:eastAsia="Times New Roman" w:cs="Times New Roman"/>
-          <w:b w:val="0"/>
-          <w:i w:val="0"/>
-          <w:color w:val="000000"/>
-          <w:sz w:val="24"/>
-        </w:rPr>
-        <w:t xml:space="preserve"> không bắt lỗi: ổ đầy, thiếu quyền ghi thư mục sao lưu → ra trang lỗi.</w:t>
+        <w:t>05_cai_dat.md</w:t>
+      </w:r>
+      <w:r>
+        <w:rPr>
+          <w:rFonts w:ascii="Times New Roman" w:hAnsi="Times New Roman" w:eastAsia="Times New Roman" w:cs="Times New Roman"/>
+          <w:b w:val="0"/>
+          <w:i w:val="0"/>
+          <w:color w:val="000000"/>
+          <w:sz w:val="24"/>
+        </w:rPr>
+        <w:t xml:space="preserve"> mục 4.1 đang kiểm tra bằng tay (curl) mỗi lần, không lưu lại được.</w:t>
       </w:r>
     </w:p>
     <w:p>
@@ -5496,17 +5891,17 @@
           <w:color w:val="000000"/>
           <w:sz w:val="24"/>
         </w:rPr>
-        <w:t>Sửa:</w:t>
-      </w:r>
-      <w:r>
-        <w:rPr>
-          <w:rFonts w:ascii="Times New Roman" w:hAnsi="Times New Roman" w:eastAsia="Times New Roman" w:cs="Times New Roman"/>
-          <w:b w:val="0"/>
-          <w:i w:val="0"/>
-          <w:color w:val="000000"/>
-          <w:sz w:val="24"/>
-        </w:rPr>
-        <w:t xml:space="preserve"> Việt hóa </w:t>
+        <w:t>Làm:</w:t>
+      </w:r>
+      <w:r>
+        <w:rPr>
+          <w:rFonts w:ascii="Times New Roman" w:hAnsi="Times New Roman" w:eastAsia="Times New Roman" w:cs="Times New Roman"/>
+          <w:b w:val="0"/>
+          <w:i w:val="0"/>
+          <w:color w:val="000000"/>
+          <w:sz w:val="24"/>
+        </w:rPr>
+        <w:t xml:space="preserve"> </w:t>
       </w:r>
       <w:r>
         <w:rPr>
@@ -5516,17 +5911,17 @@
           <w:color w:val="000000"/>
           <w:sz w:val="22"/>
         </w:rPr>
-        <w:t>Error.cshtml</w:t>
-      </w:r>
-      <w:r>
-        <w:rPr>
-          <w:rFonts w:ascii="Times New Roman" w:hAnsi="Times New Roman" w:eastAsia="Times New Roman" w:cs="Times New Roman"/>
-          <w:b w:val="0"/>
-          <w:i w:val="0"/>
-          <w:color w:val="000000"/>
-          <w:sz w:val="24"/>
-        </w:rPr>
-        <w:t xml:space="preserve"> (câu báo, gợi ý quay lại, mã yêu cầu để báo quản trị viên). Ở </w:t>
+        <w:t>demo/kiem_tra_quyen.py</w:t>
+      </w:r>
+      <w:r>
+        <w:rPr>
+          <w:rFonts w:ascii="Times New Roman" w:hAnsi="Times New Roman" w:eastAsia="Times New Roman" w:cs="Times New Roman"/>
+          <w:b w:val="0"/>
+          <w:i w:val="0"/>
+          <w:color w:val="000000"/>
+          <w:sz w:val="24"/>
+        </w:rPr>
+        <w:t xml:space="preserve"> (hoặc </w:t>
       </w:r>
       <w:r>
         <w:rPr>
@@ -5536,17 +5931,17 @@
           <w:color w:val="000000"/>
           <w:sz w:val="22"/>
         </w:rPr>
-        <w:t>SaoLuu.OnPostAsync</w:t>
-      </w:r>
-      <w:r>
-        <w:rPr>
-          <w:rFonts w:ascii="Times New Roman" w:hAnsi="Times New Roman" w:eastAsia="Times New Roman" w:cs="Times New Roman"/>
-          <w:b w:val="0"/>
-          <w:i w:val="0"/>
-          <w:color w:val="000000"/>
-          <w:sz w:val="24"/>
-        </w:rPr>
-        <w:t xml:space="preserve"> bắt </w:t>
+        <w:t>.ps1</w:t>
+      </w:r>
+      <w:r>
+        <w:rPr>
+          <w:rFonts w:ascii="Times New Roman" w:hAnsi="Times New Roman" w:eastAsia="Times New Roman" w:cs="Times New Roman"/>
+          <w:b w:val="0"/>
+          <w:i w:val="0"/>
+          <w:color w:val="000000"/>
+          <w:sz w:val="24"/>
+        </w:rPr>
+        <w:t xml:space="preserve">): đăng nhập 8 tài khoản mẫu (lấy </w:t>
       </w:r>
       <w:r>
         <w:rPr>
@@ -5556,17 +5951,34 @@
           <w:color w:val="000000"/>
           <w:sz w:val="22"/>
         </w:rPr>
-        <w:t>SqlException</w:t>
-      </w:r>
-      <w:r>
-        <w:rPr>
-          <w:rFonts w:ascii="Times New Roman" w:hAnsi="Times New Roman" w:eastAsia="Times New Roman" w:cs="Times New Roman"/>
-          <w:b w:val="0"/>
-          <w:i w:val="0"/>
-          <w:color w:val="000000"/>
-          <w:sz w:val="24"/>
-        </w:rPr>
-        <w:t xml:space="preserve">, hiện câu lỗi tiếng Việt kèm gợi ý (kiểm tra dung lượng ổ, quyền của dịch vụ SQL Server với thư mục Backup), vẫn ghi nhật ký khi thành công. Thử trang lỗi bằng </w:t>
+        <w:t>__RequestVerificationToken</w:t>
+      </w:r>
+      <w:r>
+        <w:rPr>
+          <w:rFonts w:ascii="Times New Roman" w:hAnsi="Times New Roman" w:eastAsia="Times New Roman" w:cs="Times New Roman"/>
+          <w:b w:val="0"/>
+          <w:i w:val="0"/>
+          <w:color w:val="000000"/>
+          <w:sz w:val="24"/>
+        </w:rPr>
+        <w:t xml:space="preserve"> từ /DangNhap; dùng hv0412 thay hv0480 vì hv0480 bị bắt đổi mật khẩu); với mỗi vai trò:</w:t>
+      </w:r>
+    </w:p>
+    <w:p>
+      <w:pPr>
+        <w:spacing w:after="60"/>
+        <w:ind w:left="794" w:hanging="255"/>
+        <w:jc w:val="left"/>
+      </w:pPr>
+      <w:r>
+        <w:rPr>
+          <w:rFonts w:ascii="Times New Roman" w:hAnsi="Times New Roman" w:eastAsia="Times New Roman" w:cs="Times New Roman"/>
+          <w:b w:val="0"/>
+          <w:i w:val="0"/>
+          <w:color w:val="000000"/>
+          <w:sz w:val="24"/>
+        </w:rPr>
+        <w:t xml:space="preserve">– mọi liên kết trên thực đơn chính (trang </w:t>
       </w:r>
       <w:r>
         <w:rPr>
@@ -5576,17 +5988,34 @@
           <w:color w:val="000000"/>
           <w:sz w:val="22"/>
         </w:rPr>
-        <w:t>--launch-profile</w:t>
-      </w:r>
-      <w:r>
-        <w:rPr>
-          <w:rFonts w:ascii="Times New Roman" w:hAnsi="Times New Roman" w:eastAsia="Times New Roman" w:cs="Times New Roman"/>
-          <w:b w:val="0"/>
-          <w:i w:val="0"/>
-          <w:color w:val="000000"/>
-          <w:sz w:val="24"/>
-        </w:rPr>
-        <w:t xml:space="preserve"> có </w:t>
+        <w:t>/</w:t>
+      </w:r>
+      <w:r>
+        <w:rPr>
+          <w:rFonts w:ascii="Times New Roman" w:hAnsi="Times New Roman" w:eastAsia="Times New Roman" w:cs="Times New Roman"/>
+          <w:b w:val="0"/>
+          <w:i w:val="0"/>
+          <w:color w:val="000000"/>
+          <w:sz w:val="24"/>
+        </w:rPr>
+        <w:t>) phải mở được (200);</w:t>
+      </w:r>
+    </w:p>
+    <w:p>
+      <w:pPr>
+        <w:spacing w:after="60"/>
+        <w:ind w:left="794" w:hanging="255"/>
+        <w:jc w:val="left"/>
+      </w:pPr>
+      <w:r>
+        <w:rPr>
+          <w:rFonts w:ascii="Times New Roman" w:hAnsi="Times New Roman" w:eastAsia="Times New Roman" w:cs="Times New Roman"/>
+          <w:b w:val="0"/>
+          <w:i w:val="0"/>
+          <w:color w:val="000000"/>
+          <w:sz w:val="24"/>
+        </w:rPr>
+        <w:t xml:space="preserve">– mọi trang trong </w:t>
       </w:r>
       <w:r>
         <w:rPr>
@@ -5596,17 +6025,37 @@
           <w:color w:val="000000"/>
           <w:sz w:val="22"/>
         </w:rPr>
-        <w:t>ASPNETCORE_ENVIRONMENT=Production</w:t>
-      </w:r>
-      <w:r>
-        <w:rPr>
-          <w:rFonts w:ascii="Times New Roman" w:hAnsi="Times New Roman" w:eastAsia="Times New Roman" w:cs="Times New Roman"/>
-          <w:b w:val="0"/>
-          <w:i w:val="0"/>
-          <w:color w:val="000000"/>
-          <w:sz w:val="24"/>
-        </w:rPr>
-        <w:t xml:space="preserve"> (thêm hồ sơ vào </w:t>
+        <w:t>ThucDon.DaLam</w:t>
+      </w:r>
+      <w:r>
+        <w:rPr>
+          <w:rFonts w:ascii="Times New Roman" w:hAnsi="Times New Roman" w:eastAsia="Times New Roman" w:cs="Times New Roman"/>
+          <w:b w:val="0"/>
+          <w:i w:val="0"/>
+          <w:color w:val="000000"/>
+          <w:sz w:val="24"/>
+        </w:rPr>
+        <w:t xml:space="preserve"> không có trên thực đơn: vai trò </w:t>
+      </w:r>
+      <w:r>
+        <w:rPr>
+          <w:rFonts w:ascii="Times New Roman" w:hAnsi="Times New Roman" w:eastAsia="Times New Roman" w:cs="Times New Roman"/>
+          <w:b/>
+          <w:i w:val="0"/>
+          <w:color w:val="000000"/>
+          <w:sz w:val="24"/>
+        </w:rPr>
+        <w:t>không có quyền nào</w:t>
+      </w:r>
+      <w:r>
+        <w:rPr>
+          <w:rFonts w:ascii="Times New Roman" w:hAnsi="Times New Roman" w:eastAsia="Times New Roman" w:cs="Times New Roman"/>
+          <w:b w:val="0"/>
+          <w:i w:val="0"/>
+          <w:color w:val="000000"/>
+          <w:sz w:val="24"/>
+        </w:rPr>
+        <w:t xml:space="preserve"> ở module đó (ma trận </w:t>
       </w:r>
       <w:r>
         <w:rPr>
@@ -5616,17 +6065,34 @@
           <w:color w:val="000000"/>
           <w:sz w:val="22"/>
         </w:rPr>
-        <w:t>launchSettings.json</w:t>
-      </w:r>
-      <w:r>
-        <w:rPr>
-          <w:rFonts w:ascii="Times New Roman" w:hAnsi="Times New Roman" w:eastAsia="Times New Roman" w:cs="Times New Roman"/>
-          <w:b w:val="0"/>
-          <w:i w:val="0"/>
-          <w:color w:val="000000"/>
-          <w:sz w:val="24"/>
-        </w:rPr>
-        <w:t xml:space="preserve"> nếu cần).</w:t>
+        <w:t>Nen/PhanQuyen.g.cs</w:t>
+      </w:r>
+      <w:r>
+        <w:rPr>
+          <w:rFonts w:ascii="Times New Roman" w:hAnsi="Times New Roman" w:eastAsia="Times New Roman" w:cs="Times New Roman"/>
+          <w:b w:val="0"/>
+          <w:i w:val="0"/>
+          <w:color w:val="000000"/>
+          <w:sz w:val="24"/>
+        </w:rPr>
+        <w:t>) phải bị chuyển về /KhongCoQuyen; vai trò có quyền xem thì được mở (vd Giám đốc xem F2.3).</w:t>
+      </w:r>
+    </w:p>
+    <w:p>
+      <w:pPr>
+        <w:spacing w:after="60"/>
+        <w:ind w:left="794" w:hanging="255"/>
+        <w:jc w:val="left"/>
+      </w:pPr>
+      <w:r>
+        <w:rPr>
+          <w:rFonts w:ascii="Times New Roman" w:hAnsi="Times New Roman" w:eastAsia="Times New Roman" w:cs="Times New Roman"/>
+          <w:b w:val="0"/>
+          <w:i w:val="0"/>
+          <w:color w:val="000000"/>
+          <w:sz w:val="24"/>
+        </w:rPr>
+        <w:t>– In bảng vai trò × trang, cuối cùng "đạt" / danh sách sai.</w:t>
       </w:r>
     </w:p>
     <w:p>
@@ -5663,7 +6129,27 @@
           <w:color w:val="000000"/>
           <w:sz w:val="24"/>
         </w:rPr>
-        <w:t xml:space="preserve"> sửa dòng TC33 (thêm trường hợp sao lưu lỗi).</w:t>
+        <w:t xml:space="preserve"> TC42; ghi lệnh chạy vào </w:t>
+      </w:r>
+      <w:r>
+        <w:rPr>
+          <w:rFonts w:ascii="Consolas" w:hAnsi="Consolas" w:eastAsia="Consolas" w:cs="Consolas"/>
+          <w:b w:val="0"/>
+          <w:i w:val="0"/>
+          <w:color w:val="000000"/>
+          <w:sz w:val="22"/>
+        </w:rPr>
+        <w:t>05_cai_dat.md</w:t>
+      </w:r>
+      <w:r>
+        <w:rPr>
+          <w:rFonts w:ascii="Times New Roman" w:hAnsi="Times New Roman" w:eastAsia="Times New Roman" w:cs="Times New Roman"/>
+          <w:b w:val="0"/>
+          <w:i w:val="0"/>
+          <w:color w:val="000000"/>
+          <w:sz w:val="24"/>
+        </w:rPr>
+        <w:t xml:space="preserve"> mục 4.1 dòng "Phân quyền".</w:t>
       </w:r>
     </w:p>
     <w:p>
@@ -5671,7 +6157,7 @@
         <w:pStyle w:val="Heading3"/>
       </w:pPr>
       <w:r>
-        <w:t>Q2. Lưu nháp theo tài khoản (N6)</w:t>
+        <w:t>Q4. Sửa phan_tich/06_bao_tri.md cho khớp hiện trạng</w:t>
       </w:r>
     </w:p>
     <w:p>
@@ -5688,27 +6174,7 @@
           <w:color w:val="000000"/>
           <w:sz w:val="24"/>
         </w:rPr>
-        <w:t xml:space="preserve">– </w:t>
-      </w:r>
-      <w:r>
-        <w:rPr>
-          <w:rFonts w:ascii="Times New Roman" w:hAnsi="Times New Roman" w:eastAsia="Times New Roman" w:cs="Times New Roman"/>
-          <w:b/>
-          <w:i w:val="0"/>
-          <w:color w:val="000000"/>
-          <w:sz w:val="24"/>
-        </w:rPr>
-        <w:t>Lỗi:</w:t>
-      </w:r>
-      <w:r>
-        <w:rPr>
-          <w:rFonts w:ascii="Times New Roman" w:hAnsi="Times New Roman" w:eastAsia="Times New Roman" w:cs="Times New Roman"/>
-          <w:b w:val="0"/>
-          <w:i w:val="0"/>
-          <w:color w:val="000000"/>
-          <w:sz w:val="24"/>
-        </w:rPr>
-        <w:t xml:space="preserve"> </w:t>
+        <w:t xml:space="preserve">– Mục 2, bước 5: </w:t>
       </w:r>
       <w:r>
         <w:rPr>
@@ -5718,37 +6184,17 @@
           <w:color w:val="000000"/>
           <w:sz w:val="22"/>
         </w:rPr>
-        <w:t>Pages/Shared/_LuuNhap.cshtml</w:t>
-      </w:r>
-      <w:r>
-        <w:rPr>
-          <w:rFonts w:ascii="Times New Roman" w:hAnsi="Times New Roman" w:eastAsia="Times New Roman" w:cs="Times New Roman"/>
-          <w:b w:val="0"/>
-          <w:i w:val="0"/>
-          <w:color w:val="000000"/>
-          <w:sz w:val="24"/>
-        </w:rPr>
-        <w:t xml:space="preserve"> lưu nháp trong trình duyệt theo khóa "phiếu + học viên + các dòng", </w:t>
-      </w:r>
-      <w:r>
-        <w:rPr>
-          <w:rFonts w:ascii="Times New Roman" w:hAnsi="Times New Roman" w:eastAsia="Times New Roman" w:cs="Times New Roman"/>
-          <w:b/>
-          <w:i w:val="0"/>
-          <w:color w:val="000000"/>
-          <w:sz w:val="24"/>
-        </w:rPr>
-        <w:t>không có tên đăng nhập</w:t>
-      </w:r>
-      <w:r>
-        <w:rPr>
-          <w:rFonts w:ascii="Times New Roman" w:hAnsi="Times New Roman" w:eastAsia="Times New Roman" w:cs="Times New Roman"/>
-          <w:b w:val="0"/>
-          <w:i w:val="0"/>
-          <w:color w:val="000000"/>
-          <w:sz w:val="24"/>
-        </w:rPr>
-        <w:t>. Máy dùng chung: người sau mở F3.2 cùng học viên thấy nháp của người trước (tên người nộp, số tiền).</w:t>
+        <w:t>dotnet test (38 ca)</w:t>
+      </w:r>
+      <w:r>
+        <w:rPr>
+          <w:rFonts w:ascii="Times New Roman" w:hAnsi="Times New Roman" w:eastAsia="Times New Roman" w:cs="Times New Roman"/>
+          <w:b w:val="0"/>
+          <w:i w:val="0"/>
+          <w:color w:val="000000"/>
+          <w:sz w:val="24"/>
+        </w:rPr>
+        <w:t xml:space="preserve"> → số ca hiện tại (80, cộng số test mọi người thêm).</w:t>
       </w:r>
     </w:p>
     <w:p>
@@ -5765,87 +6211,7 @@
           <w:color w:val="000000"/>
           <w:sz w:val="24"/>
         </w:rPr>
-        <w:t xml:space="preserve">– </w:t>
-      </w:r>
-      <w:r>
-        <w:rPr>
-          <w:rFonts w:ascii="Times New Roman" w:hAnsi="Times New Roman" w:eastAsia="Times New Roman" w:cs="Times New Roman"/>
-          <w:b/>
-          <w:i w:val="0"/>
-          <w:color w:val="000000"/>
-          <w:sz w:val="24"/>
-        </w:rPr>
-        <w:t>Sửa:</w:t>
-      </w:r>
-      <w:r>
-        <w:rPr>
-          <w:rFonts w:ascii="Times New Roman" w:hAnsi="Times New Roman" w:eastAsia="Times New Roman" w:cs="Times New Roman"/>
-          <w:b w:val="0"/>
-          <w:i w:val="0"/>
-          <w:color w:val="000000"/>
-          <w:sz w:val="24"/>
-        </w:rPr>
-        <w:t xml:space="preserve"> thêm tên đăng nhập (</w:t>
-      </w:r>
-      <w:r>
-        <w:rPr>
-          <w:rFonts w:ascii="Consolas" w:hAnsi="Consolas" w:eastAsia="Consolas" w:cs="Consolas"/>
-          <w:b w:val="0"/>
-          <w:i w:val="0"/>
-          <w:color w:val="000000"/>
-          <w:sz w:val="22"/>
-        </w:rPr>
-        <w:t>User.TenDangNhap()</w:t>
-      </w:r>
-      <w:r>
-        <w:rPr>
-          <w:rFonts w:ascii="Times New Roman" w:hAnsi="Times New Roman" w:eastAsia="Times New Roman" w:cs="Times New Roman"/>
-          <w:b w:val="0"/>
-          <w:i w:val="0"/>
-          <w:color w:val="000000"/>
-          <w:sz w:val="24"/>
-        </w:rPr>
-        <w:t>) vào khóa; khi đăng xuất (</w:t>
-      </w:r>
-      <w:r>
-        <w:rPr>
-          <w:rFonts w:ascii="Consolas" w:hAnsi="Consolas" w:eastAsia="Consolas" w:cs="Consolas"/>
-          <w:b w:val="0"/>
-          <w:i w:val="0"/>
-          <w:color w:val="000000"/>
-          <w:sz w:val="22"/>
-        </w:rPr>
-        <w:t>Pages/DangXuat</w:t>
-      </w:r>
-      <w:r>
-        <w:rPr>
-          <w:rFonts w:ascii="Times New Roman" w:hAnsi="Times New Roman" w:eastAsia="Times New Roman" w:cs="Times New Roman"/>
-          <w:b w:val="0"/>
-          <w:i w:val="0"/>
-          <w:color w:val="000000"/>
-          <w:sz w:val="24"/>
-        </w:rPr>
-        <w:t xml:space="preserve">) xóa các khóa </w:t>
-      </w:r>
-      <w:r>
-        <w:rPr>
-          <w:rFonts w:ascii="Consolas" w:hAnsi="Consolas" w:eastAsia="Consolas" w:cs="Consolas"/>
-          <w:b w:val="0"/>
-          <w:i w:val="0"/>
-          <w:color w:val="000000"/>
-          <w:sz w:val="22"/>
-        </w:rPr>
-        <w:t>nhap:</w:t>
-      </w:r>
-      <w:r>
-        <w:rPr>
-          <w:rFonts w:ascii="Times New Roman" w:hAnsi="Times New Roman" w:eastAsia="Times New Roman" w:cs="Times New Roman"/>
-          <w:b w:val="0"/>
-          <w:i w:val="0"/>
-          <w:color w:val="000000"/>
-          <w:sz w:val="24"/>
-        </w:rPr>
-        <w:t xml:space="preserve"> của người đó.</w:t>
+        <w:t>– Mục 1, dòng "Phòng ngừa": đếm khóa đăng nhập trong CSDL, bắt đổi mật khẩu lần đầu đã làm (B2, B4) → ghi "(đã làm, B2, B4)".</w:t>
       </w:r>
     </w:p>
     <w:p>
@@ -5862,7 +6228,27 @@
           <w:color w:val="000000"/>
           <w:sz w:val="24"/>
         </w:rPr>
-        <w:t xml:space="preserve">– </w:t>
+        <w:t xml:space="preserve">– Mục 5, hướng SMS/Zalo: bảng </w:t>
+      </w:r>
+      <w:r>
+        <w:rPr>
+          <w:rFonts w:ascii="Consolas" w:hAnsi="Consolas" w:eastAsia="Consolas" w:cs="Consolas"/>
+          <w:b w:val="0"/>
+          <w:i w:val="0"/>
+          <w:color w:val="000000"/>
+          <w:sz w:val="22"/>
+        </w:rPr>
+        <w:t>ThongBao</w:t>
+      </w:r>
+      <w:r>
+        <w:rPr>
+          <w:rFonts w:ascii="Times New Roman" w:hAnsi="Times New Roman" w:eastAsia="Times New Roman" w:cs="Times New Roman"/>
+          <w:b w:val="0"/>
+          <w:i w:val="0"/>
+          <w:color w:val="000000"/>
+          <w:sz w:val="24"/>
+        </w:rPr>
+        <w:t xml:space="preserve"> </w:t>
       </w:r>
       <w:r>
         <w:rPr>
@@ -5872,25 +6258,37 @@
           <w:color w:val="000000"/>
           <w:sz w:val="24"/>
         </w:rPr>
-        <w:t>Ca kiểm thử:</w:t>
-      </w:r>
-      <w:r>
-        <w:rPr>
-          <w:rFonts w:ascii="Times New Roman" w:hAnsi="Times New Roman" w:eastAsia="Times New Roman" w:cs="Times New Roman"/>
-          <w:b w:val="0"/>
-          <w:i w:val="0"/>
-          <w:color w:val="000000"/>
-          <w:sz w:val="24"/>
-        </w:rPr>
-        <w:t xml:space="preserve"> sửa dòng TC34 (nv004 lưu nháp, đăng xuất; tài khoản kế toán khác không thấy nháp).</w:t>
-      </w:r>
-    </w:p>
-    <w:p>
-      <w:pPr>
-        <w:pStyle w:val="Heading3"/>
-      </w:pPr>
-      <w:r>
-        <w:t>Q3. Script kiểm tra phân quyền 8 vai trò (làm sau cùng, khi các trang mới đã gộp)</w:t>
+        <w:t>đã có</w:t>
+      </w:r>
+      <w:r>
+        <w:rPr>
+          <w:rFonts w:ascii="Times New Roman" w:hAnsi="Times New Roman" w:eastAsia="Times New Roman" w:cs="Times New Roman"/>
+          <w:b w:val="0"/>
+          <w:i w:val="0"/>
+          <w:color w:val="000000"/>
+          <w:sz w:val="24"/>
+        </w:rPr>
+        <w:t xml:space="preserve"> cột </w:t>
+      </w:r>
+      <w:r>
+        <w:rPr>
+          <w:rFonts w:ascii="Consolas" w:hAnsi="Consolas" w:eastAsia="Consolas" w:cs="Consolas"/>
+          <w:b w:val="0"/>
+          <w:i w:val="0"/>
+          <w:color w:val="000000"/>
+          <w:sz w:val="22"/>
+        </w:rPr>
+        <w:t>TrangThaiGui</w:t>
+      </w:r>
+      <w:r>
+        <w:rPr>
+          <w:rFonts w:ascii="Times New Roman" w:hAnsi="Times New Roman" w:eastAsia="Times New Roman" w:cs="Times New Roman"/>
+          <w:b w:val="0"/>
+          <w:i w:val="0"/>
+          <w:color w:val="000000"/>
+          <w:sz w:val="24"/>
+        </w:rPr>
+        <w:t xml:space="preserve"> → chỉ cần thêm cột kênh gửi.</w:t>
       </w:r>
     </w:p>
     <w:p>
@@ -5907,47 +6305,15 @@
           <w:color w:val="000000"/>
           <w:sz w:val="24"/>
         </w:rPr>
-        <w:t xml:space="preserve">– </w:t>
-      </w:r>
-      <w:r>
-        <w:rPr>
-          <w:rFonts w:ascii="Times New Roman" w:hAnsi="Times New Roman" w:eastAsia="Times New Roman" w:cs="Times New Roman"/>
-          <w:b/>
-          <w:i w:val="0"/>
-          <w:color w:val="000000"/>
-          <w:sz w:val="24"/>
-        </w:rPr>
-        <w:t>Vì sao:</w:t>
-      </w:r>
-      <w:r>
-        <w:rPr>
-          <w:rFonts w:ascii="Times New Roman" w:hAnsi="Times New Roman" w:eastAsia="Times New Roman" w:cs="Times New Roman"/>
-          <w:b w:val="0"/>
-          <w:i w:val="0"/>
-          <w:color w:val="000000"/>
-          <w:sz w:val="24"/>
-        </w:rPr>
-        <w:t xml:space="preserve"> "Phân quyền: đạt" ở </w:t>
-      </w:r>
-      <w:r>
-        <w:rPr>
-          <w:rFonts w:ascii="Consolas" w:hAnsi="Consolas" w:eastAsia="Consolas" w:cs="Consolas"/>
-          <w:b w:val="0"/>
-          <w:i w:val="0"/>
-          <w:color w:val="000000"/>
-          <w:sz w:val="22"/>
-        </w:rPr>
-        <w:t>05_cai_dat.md</w:t>
-      </w:r>
-      <w:r>
-        <w:rPr>
-          <w:rFonts w:ascii="Times New Roman" w:hAnsi="Times New Roman" w:eastAsia="Times New Roman" w:cs="Times New Roman"/>
-          <w:b w:val="0"/>
-          <w:i w:val="0"/>
-          <w:color w:val="000000"/>
-          <w:sz w:val="24"/>
-        </w:rPr>
-        <w:t xml:space="preserve"> mục 4.1 đang kiểm tra bằng tay (curl) mỗi lần, không lưu lại được.</w:t>
+        <w:t>– Mục 3.3: thống nhất câu về phiên bản CSDL với việc H2 của Hùng (gộp sau H2).</w:t>
+      </w:r>
+    </w:p>
+    <w:p>
+      <w:pPr>
+        <w:pStyle w:val="Heading3"/>
+      </w:pPr>
+      <w:r>
+        <w:t>Q5. Thử giao diện trên máy thật</w:t>
       </w:r>
     </w:p>
     <w:p>
@@ -5964,127 +6330,7 @@
           <w:color w:val="000000"/>
           <w:sz w:val="24"/>
         </w:rPr>
-        <w:t xml:space="preserve">– </w:t>
-      </w:r>
-      <w:r>
-        <w:rPr>
-          <w:rFonts w:ascii="Times New Roman" w:hAnsi="Times New Roman" w:eastAsia="Times New Roman" w:cs="Times New Roman"/>
-          <w:b/>
-          <w:i w:val="0"/>
-          <w:color w:val="000000"/>
-          <w:sz w:val="24"/>
-        </w:rPr>
-        <w:t>Làm:</w:t>
-      </w:r>
-      <w:r>
-        <w:rPr>
-          <w:rFonts w:ascii="Times New Roman" w:hAnsi="Times New Roman" w:eastAsia="Times New Roman" w:cs="Times New Roman"/>
-          <w:b w:val="0"/>
-          <w:i w:val="0"/>
-          <w:color w:val="000000"/>
-          <w:sz w:val="24"/>
-        </w:rPr>
-        <w:t xml:space="preserve"> </w:t>
-      </w:r>
-      <w:r>
-        <w:rPr>
-          <w:rFonts w:ascii="Consolas" w:hAnsi="Consolas" w:eastAsia="Consolas" w:cs="Consolas"/>
-          <w:b w:val="0"/>
-          <w:i w:val="0"/>
-          <w:color w:val="000000"/>
-          <w:sz w:val="22"/>
-        </w:rPr>
-        <w:t>demo/kiem_tra_quyen.py</w:t>
-      </w:r>
-      <w:r>
-        <w:rPr>
-          <w:rFonts w:ascii="Times New Roman" w:hAnsi="Times New Roman" w:eastAsia="Times New Roman" w:cs="Times New Roman"/>
-          <w:b w:val="0"/>
-          <w:i w:val="0"/>
-          <w:color w:val="000000"/>
-          <w:sz w:val="24"/>
-        </w:rPr>
-        <w:t xml:space="preserve"> (hoặc </w:t>
-      </w:r>
-      <w:r>
-        <w:rPr>
-          <w:rFonts w:ascii="Consolas" w:hAnsi="Consolas" w:eastAsia="Consolas" w:cs="Consolas"/>
-          <w:b w:val="0"/>
-          <w:i w:val="0"/>
-          <w:color w:val="000000"/>
-          <w:sz w:val="22"/>
-        </w:rPr>
-        <w:t>.ps1</w:t>
-      </w:r>
-      <w:r>
-        <w:rPr>
-          <w:rFonts w:ascii="Times New Roman" w:hAnsi="Times New Roman" w:eastAsia="Times New Roman" w:cs="Times New Roman"/>
-          <w:b w:val="0"/>
-          <w:i w:val="0"/>
-          <w:color w:val="000000"/>
-          <w:sz w:val="24"/>
-        </w:rPr>
-        <w:t xml:space="preserve">): đọc </w:t>
-      </w:r>
-      <w:r>
-        <w:rPr>
-          <w:rFonts w:ascii="Consolas" w:hAnsi="Consolas" w:eastAsia="Consolas" w:cs="Consolas"/>
-          <w:b w:val="0"/>
-          <w:i w:val="0"/>
-          <w:color w:val="000000"/>
-          <w:sz w:val="22"/>
-        </w:rPr>
-        <w:t>ThucDon.DaLam</w:t>
-      </w:r>
-      <w:r>
-        <w:rPr>
-          <w:rFonts w:ascii="Times New Roman" w:hAnsi="Times New Roman" w:eastAsia="Times New Roman" w:cs="Times New Roman"/>
-          <w:b w:val="0"/>
-          <w:i w:val="0"/>
-          <w:color w:val="000000"/>
-          <w:sz w:val="24"/>
-        </w:rPr>
-        <w:t xml:space="preserve"> và ma trận </w:t>
-      </w:r>
-      <w:r>
-        <w:rPr>
-          <w:rFonts w:ascii="Consolas" w:hAnsi="Consolas" w:eastAsia="Consolas" w:cs="Consolas"/>
-          <w:b w:val="0"/>
-          <w:i w:val="0"/>
-          <w:color w:val="000000"/>
-          <w:sz w:val="22"/>
-        </w:rPr>
-        <w:t>Nen/PhanQuyen.g.cs</w:t>
-      </w:r>
-      <w:r>
-        <w:rPr>
-          <w:rFonts w:ascii="Times New Roman" w:hAnsi="Times New Roman" w:eastAsia="Times New Roman" w:cs="Times New Roman"/>
-          <w:b w:val="0"/>
-          <w:i w:val="0"/>
-          <w:color w:val="000000"/>
-          <w:sz w:val="24"/>
-        </w:rPr>
-        <w:t xml:space="preserve">; đăng nhập 8 tài khoản mẫu (lấy </w:t>
-      </w:r>
-      <w:r>
-        <w:rPr>
-          <w:rFonts w:ascii="Consolas" w:hAnsi="Consolas" w:eastAsia="Consolas" w:cs="Consolas"/>
-          <w:b w:val="0"/>
-          <w:i w:val="0"/>
-          <w:color w:val="000000"/>
-          <w:sz w:val="22"/>
-        </w:rPr>
-        <w:t>__RequestVerificationToken</w:t>
-      </w:r>
-      <w:r>
-        <w:rPr>
-          <w:rFonts w:ascii="Times New Roman" w:hAnsi="Times New Roman" w:eastAsia="Times New Roman" w:cs="Times New Roman"/>
-          <w:b w:val="0"/>
-          <w:i w:val="0"/>
-          <w:color w:val="000000"/>
-          <w:sz w:val="24"/>
-        </w:rPr>
-        <w:t xml:space="preserve"> từ /DangNhap); mở mọi trang bằng GET; so: có quyền → 200, không quyền → chuyển về /KhongCoQuyen. In bảng vai trò × trang, cuối cùng "đạt" / danh sách sai. Dùng hv0412 thay hv0480 (hv0480 bị bắt đổi mật khẩu).</w:t>
+        <w:t>– Giao diện mới mới được thử trên trình duyệt máy tính và giả lập điện thoại. Cần thử: điện thoại thật (Android, iPhone) cho F4.1 điểm danh, F4.2 nhập điểm; in thật ra giấy hoặc "Lưu PDF" cho R3.2 phiếu thu 2 liên và R4.4 giấy chứng nhận (chữ Times New Roman, không mất viền bảng, không cắt trang giữa một liên).</w:t>
       </w:r>
     </w:p>
     <w:p>
@@ -6101,27 +6347,7 @@
           <w:color w:val="000000"/>
           <w:sz w:val="24"/>
         </w:rPr>
-        <w:t xml:space="preserve">– </w:t>
-      </w:r>
-      <w:r>
-        <w:rPr>
-          <w:rFonts w:ascii="Times New Roman" w:hAnsi="Times New Roman" w:eastAsia="Times New Roman" w:cs="Times New Roman"/>
-          <w:b/>
-          <w:i w:val="0"/>
-          <w:color w:val="000000"/>
-          <w:sz w:val="24"/>
-        </w:rPr>
-        <w:t>Ca kiểm thử:</w:t>
-      </w:r>
-      <w:r>
-        <w:rPr>
-          <w:rFonts w:ascii="Times New Roman" w:hAnsi="Times New Roman" w:eastAsia="Times New Roman" w:cs="Times New Roman"/>
-          <w:b w:val="0"/>
-          <w:i w:val="0"/>
-          <w:color w:val="000000"/>
-          <w:sz w:val="24"/>
-        </w:rPr>
-        <w:t xml:space="preserve"> TC42; ghi lệnh chạy vào </w:t>
+        <w:t xml:space="preserve">– Ghi kết quả vào dòng TC43 ở </w:t>
       </w:r>
       <w:r>
         <w:rPr>
@@ -6141,15 +6367,55 @@
           <w:color w:val="000000"/>
           <w:sz w:val="24"/>
         </w:rPr>
-        <w:t xml:space="preserve"> mục 4.1 dòng "Phân quyền".</w:t>
+        <w:t xml:space="preserve">; lỗi tìm thấy thì sửa ở </w:t>
+      </w:r>
+      <w:r>
+        <w:rPr>
+          <w:rFonts w:ascii="Consolas" w:hAnsi="Consolas" w:eastAsia="Consolas" w:cs="Consolas"/>
+          <w:b w:val="0"/>
+          <w:i w:val="0"/>
+          <w:color w:val="000000"/>
+          <w:sz w:val="22"/>
+        </w:rPr>
+        <w:t>wwwroot/css/site.css</w:t>
+      </w:r>
+      <w:r>
+        <w:rPr>
+          <w:rFonts w:ascii="Times New Roman" w:hAnsi="Times New Roman" w:eastAsia="Times New Roman" w:cs="Times New Roman"/>
+          <w:b w:val="0"/>
+          <w:i w:val="0"/>
+          <w:color w:val="000000"/>
+          <w:sz w:val="24"/>
+        </w:rPr>
+        <w:t xml:space="preserve"> (mục </w:t>
+      </w:r>
+      <w:r>
+        <w:rPr>
+          <w:rFonts w:ascii="Consolas" w:hAnsi="Consolas" w:eastAsia="Consolas" w:cs="Consolas"/>
+          <w:b w:val="0"/>
+          <w:i w:val="0"/>
+          <w:color w:val="000000"/>
+          <w:sz w:val="22"/>
+        </w:rPr>
+        <w:t>@media print</w:t>
+      </w:r>
+      <w:r>
+        <w:rPr>
+          <w:rFonts w:ascii="Times New Roman" w:hAnsi="Times New Roman" w:eastAsia="Times New Roman" w:cs="Times New Roman"/>
+          <w:b w:val="0"/>
+          <w:i w:val="0"/>
+          <w:color w:val="000000"/>
+          <w:sz w:val="24"/>
+        </w:rPr>
+        <w:t>).</w:t>
       </w:r>
     </w:p>
     <w:p>
       <w:pPr>
-        <w:pStyle w:val="Heading3"/>
+        <w:pStyle w:val="Heading2"/>
       </w:pPr>
       <w:r>
-        <w:t>Q4. Sửa phan_tich/06_bao_tri.md cho khớp hiện trạng</w:t>
+        <w:t>6. Hoàng Văn Huynh – điều phối</w:t>
       </w:r>
     </w:p>
     <w:p>
@@ -6166,7 +6432,7 @@
           <w:color w:val="000000"/>
           <w:sz w:val="24"/>
         </w:rPr>
-        <w:t xml:space="preserve">– Mục 2, bước 5: </w:t>
+        <w:t xml:space="preserve">1. Trước khi giao: đẩy các commit đang có trên </w:t>
       </w:r>
       <w:r>
         <w:rPr>
@@ -6176,162 +6442,6 @@
           <w:color w:val="000000"/>
           <w:sz w:val="22"/>
         </w:rPr>
-        <w:t>dotnet test (38 ca)</w:t>
-      </w:r>
-      <w:r>
-        <w:rPr>
-          <w:rFonts w:ascii="Times New Roman" w:hAnsi="Times New Roman" w:eastAsia="Times New Roman" w:cs="Times New Roman"/>
-          <w:b w:val="0"/>
-          <w:i w:val="0"/>
-          <w:color w:val="000000"/>
-          <w:sz w:val="24"/>
-        </w:rPr>
-        <w:t xml:space="preserve"> → số ca hiện tại (80, cộng số test mọi người thêm).</w:t>
-      </w:r>
-    </w:p>
-    <w:p>
-      <w:pPr>
-        <w:spacing w:after="60"/>
-        <w:ind w:left="454" w:hanging="255"/>
-        <w:jc w:val="left"/>
-      </w:pPr>
-      <w:r>
-        <w:rPr>
-          <w:rFonts w:ascii="Times New Roman" w:hAnsi="Times New Roman" w:eastAsia="Times New Roman" w:cs="Times New Roman"/>
-          <w:b w:val="0"/>
-          <w:i w:val="0"/>
-          <w:color w:val="000000"/>
-          <w:sz w:val="24"/>
-        </w:rPr>
-        <w:t>– Mục 1, dòng "Phòng ngừa": đếm khóa đăng nhập trong CSDL, bắt đổi mật khẩu lần đầu đã làm (B2, B4) → ghi "(đã làm, B2, B4)".</w:t>
-      </w:r>
-    </w:p>
-    <w:p>
-      <w:pPr>
-        <w:spacing w:after="60"/>
-        <w:ind w:left="454" w:hanging="255"/>
-        <w:jc w:val="left"/>
-      </w:pPr>
-      <w:r>
-        <w:rPr>
-          <w:rFonts w:ascii="Times New Roman" w:hAnsi="Times New Roman" w:eastAsia="Times New Roman" w:cs="Times New Roman"/>
-          <w:b w:val="0"/>
-          <w:i w:val="0"/>
-          <w:color w:val="000000"/>
-          <w:sz w:val="24"/>
-        </w:rPr>
-        <w:t xml:space="preserve">– Mục 5, hướng SMS/Zalo: bảng </w:t>
-      </w:r>
-      <w:r>
-        <w:rPr>
-          <w:rFonts w:ascii="Consolas" w:hAnsi="Consolas" w:eastAsia="Consolas" w:cs="Consolas"/>
-          <w:b w:val="0"/>
-          <w:i w:val="0"/>
-          <w:color w:val="000000"/>
-          <w:sz w:val="22"/>
-        </w:rPr>
-        <w:t>ThongBao</w:t>
-      </w:r>
-      <w:r>
-        <w:rPr>
-          <w:rFonts w:ascii="Times New Roman" w:hAnsi="Times New Roman" w:eastAsia="Times New Roman" w:cs="Times New Roman"/>
-          <w:b w:val="0"/>
-          <w:i w:val="0"/>
-          <w:color w:val="000000"/>
-          <w:sz w:val="24"/>
-        </w:rPr>
-        <w:t xml:space="preserve"> </w:t>
-      </w:r>
-      <w:r>
-        <w:rPr>
-          <w:rFonts w:ascii="Times New Roman" w:hAnsi="Times New Roman" w:eastAsia="Times New Roman" w:cs="Times New Roman"/>
-          <w:b/>
-          <w:i w:val="0"/>
-          <w:color w:val="000000"/>
-          <w:sz w:val="24"/>
-        </w:rPr>
-        <w:t>đã có</w:t>
-      </w:r>
-      <w:r>
-        <w:rPr>
-          <w:rFonts w:ascii="Times New Roman" w:hAnsi="Times New Roman" w:eastAsia="Times New Roman" w:cs="Times New Roman"/>
-          <w:b w:val="0"/>
-          <w:i w:val="0"/>
-          <w:color w:val="000000"/>
-          <w:sz w:val="24"/>
-        </w:rPr>
-        <w:t xml:space="preserve"> cột </w:t>
-      </w:r>
-      <w:r>
-        <w:rPr>
-          <w:rFonts w:ascii="Consolas" w:hAnsi="Consolas" w:eastAsia="Consolas" w:cs="Consolas"/>
-          <w:b w:val="0"/>
-          <w:i w:val="0"/>
-          <w:color w:val="000000"/>
-          <w:sz w:val="22"/>
-        </w:rPr>
-        <w:t>TrangThaiGui</w:t>
-      </w:r>
-      <w:r>
-        <w:rPr>
-          <w:rFonts w:ascii="Times New Roman" w:hAnsi="Times New Roman" w:eastAsia="Times New Roman" w:cs="Times New Roman"/>
-          <w:b w:val="0"/>
-          <w:i w:val="0"/>
-          <w:color w:val="000000"/>
-          <w:sz w:val="24"/>
-        </w:rPr>
-        <w:t xml:space="preserve"> → chỉ cần thêm cột kênh gửi.</w:t>
-      </w:r>
-    </w:p>
-    <w:p>
-      <w:pPr>
-        <w:spacing w:after="60"/>
-        <w:ind w:left="454" w:hanging="255"/>
-        <w:jc w:val="left"/>
-      </w:pPr>
-      <w:r>
-        <w:rPr>
-          <w:rFonts w:ascii="Times New Roman" w:hAnsi="Times New Roman" w:eastAsia="Times New Roman" w:cs="Times New Roman"/>
-          <w:b w:val="0"/>
-          <w:i w:val="0"/>
-          <w:color w:val="000000"/>
-          <w:sz w:val="24"/>
-        </w:rPr>
-        <w:t>– Mục 3.3: thống nhất câu về phiên bản CSDL với việc H2 của Hùng (gộp sau H2).</w:t>
-      </w:r>
-    </w:p>
-    <w:p>
-      <w:pPr>
-        <w:pStyle w:val="Heading2"/>
-      </w:pPr>
-      <w:r>
-        <w:t>6. Hoàng Văn Huynh – điều phối</w:t>
-      </w:r>
-    </w:p>
-    <w:p>
-      <w:pPr>
-        <w:spacing w:after="60"/>
-        <w:ind w:left="454" w:hanging="255"/>
-        <w:jc w:val="left"/>
-      </w:pPr>
-      <w:r>
-        <w:rPr>
-          <w:rFonts w:ascii="Times New Roman" w:hAnsi="Times New Roman" w:eastAsia="Times New Roman" w:cs="Times New Roman"/>
-          <w:b w:val="0"/>
-          <w:i w:val="0"/>
-          <w:color w:val="000000"/>
-          <w:sz w:val="24"/>
-        </w:rPr>
-        <w:t xml:space="preserve">1. Trước khi giao: đẩy 19 commit đang có trên </w:t>
-      </w:r>
-      <w:r>
-        <w:rPr>
-          <w:rFonts w:ascii="Consolas" w:hAnsi="Consolas" w:eastAsia="Consolas" w:cs="Consolas"/>
-          <w:b w:val="0"/>
-          <w:i w:val="0"/>
-          <w:color w:val="000000"/>
-          <w:sz w:val="22"/>
-        </w:rPr>
         <w:t>main</w:t>
       </w:r>
       <w:r>
@@ -6342,7 +6452,7 @@
           <w:color w:val="000000"/>
           <w:sz w:val="24"/>
         </w:rPr>
-        <w:t xml:space="preserve"> máy mình lên GitHub (qua nhánh + pull request đúng quy trình 06_bao_tri), báo nhóm </w:t>
+        <w:t xml:space="preserve"> máy mình (code bổ sung, sửa giao diện, giao diện mới) lên GitHub (qua nhánh + pull request đúng quy trình 06_bao_tri), báo nhóm </w:t>
       </w:r>
       <w:r>
         <w:rPr>

</xml_diff>

<commit_message>
Giao diện v2 "Vở ô li và mực tím": site.css (tím mực, bút đỏ, dải đầu trang kẻ ô li, Literata), _Layout (.dau-trang toàn bề ngang + .than-trang), bảng điểm R4.3a/R4.4 (HienThi.Diem dấu phẩy, nhãn xếp loại HienThi.Xep, dòng không đạt chữ đỏ); 06_giao_dien 5.2, PHAN_CONG_SUA, 05_cai_dat TC43, KE_HOACH; dựng lại báo cáo tổng và file phân công
Co-Authored-By: Claude Opus 5.5 <noreply@anthropic.com>
</commit_message>
<xml_diff>
--- a/bao_cao/Phan_cong_sua_Nhom_10.docx
+++ b/bao_cao/Phan_cong_sua_Nhom_10.docx
@@ -1917,7 +1917,7 @@
           <w:color w:val="000000"/>
           <w:sz w:val="24"/>
         </w:rPr>
-        <w:t xml:space="preserve">– chỉ dùng màu có sẵn (đen, xám, đỏ </w:t>
+        <w:t xml:space="preserve">– chỉ dùng màu có sẵn (giao diện v2: tím mực cho nút, đỏ </w:t>
       </w:r>
       <w:r>
         <w:rPr>
@@ -1937,7 +1937,124 @@
           <w:color w:val="000000"/>
           <w:sz w:val="24"/>
         </w:rPr>
-        <w:t xml:space="preserve"> cho cảnh báo); không thêm màu riêng.</w:t>
+        <w:t xml:space="preserve"> cho cảnh báo); không thêm màu riêng;</w:t>
+      </w:r>
+    </w:p>
+    <w:p>
+      <w:pPr>
+        <w:spacing w:after="60"/>
+        <w:ind w:left="794" w:hanging="255"/>
+        <w:jc w:val="left"/>
+      </w:pPr>
+      <w:r>
+        <w:rPr>
+          <w:rFonts w:ascii="Times New Roman" w:hAnsi="Times New Roman" w:eastAsia="Times New Roman" w:cs="Times New Roman"/>
+          <w:b w:val="0"/>
+          <w:i w:val="0"/>
+          <w:color w:val="000000"/>
+          <w:sz w:val="24"/>
+        </w:rPr>
+        <w:t xml:space="preserve">– bảng điểm: điểm </w:t>
+      </w:r>
+      <w:r>
+        <w:rPr>
+          <w:rFonts w:ascii="Consolas" w:hAnsi="Consolas" w:eastAsia="Consolas" w:cs="Consolas"/>
+          <w:b w:val="0"/>
+          <w:i w:val="0"/>
+          <w:color w:val="000000"/>
+          <w:sz w:val="22"/>
+        </w:rPr>
+        <w:t>HienThi.Diem(x)</w:t>
+      </w:r>
+      <w:r>
+        <w:rPr>
+          <w:rFonts w:ascii="Times New Roman" w:hAnsi="Times New Roman" w:eastAsia="Times New Roman" w:cs="Times New Roman"/>
+          <w:b w:val="0"/>
+          <w:i w:val="0"/>
+          <w:color w:val="000000"/>
+          <w:sz w:val="24"/>
+        </w:rPr>
+        <w:t xml:space="preserve"> (dấu phẩy) trong ô </w:t>
+      </w:r>
+      <w:r>
+        <w:rPr>
+          <w:rFonts w:ascii="Consolas" w:hAnsi="Consolas" w:eastAsia="Consolas" w:cs="Consolas"/>
+          <w:b w:val="0"/>
+          <w:i w:val="0"/>
+          <w:color w:val="000000"/>
+          <w:sz w:val="22"/>
+        </w:rPr>
+        <w:t>class="so diem"</w:t>
+      </w:r>
+      <w:r>
+        <w:rPr>
+          <w:rFonts w:ascii="Times New Roman" w:hAnsi="Times New Roman" w:eastAsia="Times New Roman" w:cs="Times New Roman"/>
+          <w:b w:val="0"/>
+          <w:i w:val="0"/>
+          <w:color w:val="000000"/>
+          <w:sz w:val="24"/>
+        </w:rPr>
+        <w:t xml:space="preserve">, xếp loại </w:t>
+      </w:r>
+      <w:r>
+        <w:rPr>
+          <w:rFonts w:ascii="Consolas" w:hAnsi="Consolas" w:eastAsia="Consolas" w:cs="Consolas"/>
+          <w:b w:val="0"/>
+          <w:i w:val="0"/>
+          <w:color w:val="000000"/>
+          <w:sz w:val="22"/>
+        </w:rPr>
+        <w:t>&lt;span class="@HienThi.Xep(xl)"&gt;</w:t>
+      </w:r>
+      <w:r>
+        <w:rPr>
+          <w:rFonts w:ascii="Times New Roman" w:hAnsi="Times New Roman" w:eastAsia="Times New Roman" w:cs="Times New Roman"/>
+          <w:b w:val="0"/>
+          <w:i w:val="0"/>
+          <w:color w:val="000000"/>
+          <w:sz w:val="24"/>
+        </w:rPr>
+        <w:t xml:space="preserve">, dòng không đạt </w:t>
+      </w:r>
+      <w:r>
+        <w:rPr>
+          <w:rFonts w:ascii="Consolas" w:hAnsi="Consolas" w:eastAsia="Consolas" w:cs="Consolas"/>
+          <w:b w:val="0"/>
+          <w:i w:val="0"/>
+          <w:color w:val="000000"/>
+          <w:sz w:val="22"/>
+        </w:rPr>
+        <w:t>class="khong-dat"</w:t>
+      </w:r>
+      <w:r>
+        <w:rPr>
+          <w:rFonts w:ascii="Times New Roman" w:hAnsi="Times New Roman" w:eastAsia="Times New Roman" w:cs="Times New Roman"/>
+          <w:b w:val="0"/>
+          <w:i w:val="0"/>
+          <w:color w:val="000000"/>
+          <w:sz w:val="24"/>
+        </w:rPr>
+        <w:t xml:space="preserve"> (mẫu: </w:t>
+      </w:r>
+      <w:r>
+        <w:rPr>
+          <w:rFonts w:ascii="Consolas" w:hAnsi="Consolas" w:eastAsia="Consolas" w:cs="Consolas"/>
+          <w:b w:val="0"/>
+          <w:i w:val="0"/>
+          <w:color w:val="000000"/>
+          <w:sz w:val="22"/>
+        </w:rPr>
+        <w:t>HocTap/TongKet.cshtml</w:t>
+      </w:r>
+      <w:r>
+        <w:rPr>
+          <w:rFonts w:ascii="Times New Roman" w:hAnsi="Times New Roman" w:eastAsia="Times New Roman" w:cs="Times New Roman"/>
+          <w:b w:val="0"/>
+          <w:i w:val="0"/>
+          <w:color w:val="000000"/>
+          <w:sz w:val="24"/>
+        </w:rPr>
+        <w:t>).</w:t>
       </w:r>
     </w:p>
     <w:p>

</xml_diff>